<commit_message>
docs: narrative rewrite - 作品说明/评委清单 (20261002 v2)
</commit_message>
<xml_diff>
--- a/docs/作品说明文档.docx
+++ b/docs/作品说明文档.docx
@@ -254,6 +254,43 @@
           <w:sz w:val="24"/>
         </w:rPr>
         <w:t>：石油化工类专业学生、行业科普受众</w:t>
+      </w:r>
+    </w:p>
+    <w:p>
+      <w:pPr>
+        <w:pStyle w:val="Heading1"/>
+        <w:spacing w:line="360" w:lineRule="auto" w:after="0"/>
+        <w:ind w:left="425"/>
+      </w:pPr>
+      <w:r>
+        <w:t>1.1 作品叙事定位：一滴汽油的中国之旅</w:t>
+      </w:r>
+    </w:p>
+    <w:p>
+      <w:pPr>
+        <w:spacing w:line="360" w:lineRule="auto" w:after="0"/>
+        <w:ind w:left="425"/>
+      </w:pPr>
+      <w:r>
+        <w:t>本作品不止是一个数据可视化工具，更是一个中国故事。作品以"一滴汽油的中国之旅"为叙事主线，把汽油全生命周期碳足迹讲成七幕：序幕·一滴油、第一幕·地下的中国、第二幕·路上的中国、第三幕·燃烧的时代、转折·算得清、证据·数据会说话、落点·你我参与。</w:t>
+      </w:r>
+    </w:p>
+    <w:p>
+      <w:pPr>
+        <w:spacing w:line="360" w:lineRule="auto" w:after="0"/>
+        <w:ind w:left="425"/>
+      </w:pPr>
+      <w:r>
+        <w:t>故事从新中国"贫油国"的历史讲起，途经世界第二大炼油国的产业坐标、"3060"双碳承诺与 GB/T 24067 碳足迹核算标准的落地，落笔于每一个普通人的出行选择——让"讲好中国双碳故事"从宏大叙事，落到一滴油、一次加油、一次出行。</w:t>
+      </w:r>
+    </w:p>
+    <w:p>
+      <w:pPr>
+        <w:spacing w:line="360" w:lineRule="auto" w:after="0"/>
+        <w:ind w:left="425"/>
+      </w:pPr>
+      <w:r>
+        <w:t>叙事金句："这不是一个数据工具，而是一个中国故事""从说不清到算得清，是这滴油最大的时代变化""中国双碳故事，也是我的故事"。</w:t>
       </w:r>
     </w:p>
     <w:p>
@@ -817,34 +854,7 @@
         <w:ind w:left="425" w:hanging="227"/>
       </w:pPr>
       <w:r>
-        <w:rPr>
-          <w:rFonts w:ascii="Arial" w:hAnsi="Arial" w:eastAsia="宋体"/>
-          <w:b w:val="0"/>
-          <w:i w:val="0"/>
-          <w:color w:val="000000"/>
-          <w:sz w:val="24"/>
-        </w:rPr>
-        <w:t xml:space="preserve">2. </w:t>
-      </w:r>
-      <w:r>
-        <w:rPr>
-          <w:rFonts w:ascii="Arial" w:hAnsi="Arial" w:eastAsia="宋体"/>
-          <w:b/>
-          <w:i w:val="0"/>
-          <w:color w:val="000000"/>
-          <w:sz w:val="24"/>
-        </w:rPr>
-        <w:t>叙事创新</w:t>
-      </w:r>
-      <w:r>
-        <w:rPr>
-          <w:rFonts w:ascii="Arial" w:hAnsi="Arial" w:eastAsia="宋体"/>
-          <w:b w:val="0"/>
-          <w:i w:val="0"/>
-          <w:color w:val="000000"/>
-          <w:sz w:val="24"/>
-        </w:rPr>
-        <w:t>：以"一滴汽油"为叙事主线串联完整产业链，将分散的碳排放数据绑定到每个工艺节点；</w:t>
+        <w:t>2. 叙事创新：以"一滴汽油的中国之旅"为叙事主线，用七幕结构讲述中国从"贫油国"到能源大国、迈向双碳强国的转型故事，把碳排放数据绑定到工艺节点与时代节点，让作品从"数据工具"升级为"数字中国故事"；</w:t>
       </w:r>
     </w:p>
     <w:p>
@@ -2276,6 +2286,16 @@
           <w:sz w:val="24"/>
         </w:rPr>
         <w:t xml:space="preserve"> 系统可截图、录屏二次传播，演示视频可投放短视频平台，数据与口径均可溯源，适合面向公众的科普传播。</w:t>
+      </w:r>
+    </w:p>
+    <w:p>
+      <w:pPr>
+        <w:spacing w:line="360" w:lineRule="auto" w:before="0" w:after="0"/>
+        <w:ind w:firstLine="420"/>
+        <w:jc w:val="both"/>
+      </w:pPr>
+      <w:r>
+        <w:t>（5）讲好中国故事。 本作品以"一滴汽油"为切口，用七幕叙事讲清"中国双碳故事"——从大庆油田到 3060 目标、从 GB/T 24067 落地到你我参与，把国家战略转化为大众可感知、可参与的故事，契合竞赛指定命题"科技+创意，讲好中国故事"，具备向公众传播的现实感染力。</w:t>
       </w:r>
     </w:p>
     <w:p>

</xml_diff>